<commit_message>
Switch LLM to Claude Opus 4.7 via Azure AI Foundry; fix gap-fill supplement logic and Word template style bugs
- Replace Azure GPT-4o with Claude Opus 4.7 via AnthropicFoundry SDK
- Add ChatAnthropicFoundry LangChain wrapper for chain-based summarization
- Fix gap-fill: raise threshold to 4000 chars and supplement (not replace) briefing content with call-specific transcript details
- Fix 8 Word template paragraph styles: Major_Gaps_and_Integrations.content paragraphs changed from Heading2/HTMLPreformatted to Normal
- Add load_dotenv(override=True) to ensure .env values take precedence
- Update .env.example with Anthropic Foundry variables
- Improve Tavily search with company token validation
- Fix ViewProspect 409 re-attach logic

Co-Authored-By: Claude Sonnet 4.6 <noreply@anthropic.com>
</commit_message>
<xml_diff>
--- a/word_template.docx
+++ b/word_template.docx
@@ -5452,7 +5452,7 @@
     </w:p>
     <w:p>
       <w:pPr>
-        <w:pStyle w:val="HTMLPreformatted"/>
+        <w:pStyle w:val="Normal"/>
       </w:pPr>
       <w:r>
         <w:t>{{data.Forecast_to_Fulfill_F2F.Major_Gaps_and_Integrations.content | default('')}}</w:t>
@@ -5585,7 +5585,7 @@
     </w:p>
     <w:p>
       <w:pPr>
-        <w:pStyle w:val="Heading2"/>
+        <w:pStyle w:val="Normal"/>
         <w:numPr>
           <w:ilvl w:val="0"/>
           <w:numId w:val="0"/>
@@ -5853,7 +5853,7 @@
     </w:p>
     <w:p>
       <w:pPr>
-        <w:pStyle w:val="HTMLPreformatted"/>
+        <w:pStyle w:val="Normal"/>
       </w:pPr>
       <w:r>
         <w:t>{{data.Logistics_Planning_and_Transportation_TM.Major_Gaps_and_Integrations.content | default('')}}</w:t>
@@ -6001,7 +6001,7 @@
     </w:p>
     <w:p>
       <w:pPr>
-        <w:pStyle w:val="HTMLPreformatted"/>
+        <w:pStyle w:val="Normal"/>
       </w:pPr>
       <w:r>
         <w:t>{{data.Request_to_Service_R2S.Major_Gaps_and_Integrations.content | default('')}}</w:t>
@@ -6118,7 +6118,7 @@
     </w:p>
     <w:p>
       <w:pPr>
-        <w:pStyle w:val="HTMLPreformatted"/>
+        <w:pStyle w:val="Normal"/>
       </w:pPr>
       <w:r>
         <w:t>{{data.Record_to_Report_R2R.Major_Gaps_and_Integrations.content | default('')}}</w:t>
@@ -6225,7 +6225,7 @@
     </w:p>
     <w:p>
       <w:pPr>
-        <w:pStyle w:val="HTMLPreformatted"/>
+        <w:pStyle w:val="Normal"/>
       </w:pPr>
       <w:r>
         <w:t>{{data.Acquire_to_Dispose_A2D.Major_Gaps_and_Integrations.content | default('')}}</w:t>
@@ -6377,7 +6377,7 @@
     </w:p>
     <w:p>
       <w:pPr>
-        <w:pStyle w:val="HTMLPreformatted"/>
+        <w:pStyle w:val="Normal"/>
       </w:pPr>
       <w:r>
         <w:t>{{data.Environmental_Social_and_Governance_ESG_Processes.Major_Gaps_and_Integrations.content | default('')}}</w:t>
@@ -6493,7 +6493,7 @@
     </w:p>
     <w:p>
       <w:pPr>
-        <w:pStyle w:val="HTMLPreformatted"/>
+        <w:pStyle w:val="Normal"/>
       </w:pPr>
       <w:r>
         <w:t>{{data.Hire_to_Retire_H2R.Major_Gaps_and_Integrations.content | default('')}}</w:t>

</xml_diff>